<commit_message>
Deploying to gh-pages from @ Morrison-Lab/psw@eee796c5a12d0e8efbfcdbf61fd58d09009f0069 🚀
</commit_message>
<xml_diff>
--- a/chapters/avoid-cliches.docx
+++ b/chapters/avoid-cliches.docx
@@ -15,7 +15,7 @@
         <w:pStyle w:val="Date"/>
       </w:pPr>
       <w:r>
-        <w:t xml:space="preserve">Last modified: 2026-10-13 00:05:34 (PDT)</w:t>
+        <w:t xml:space="preserve">Last modified: 2026-10-13 10:56:24 (PDT)</w:t>
       </w:r>
     </w:p>
     <w:tbl>
@@ -3239,6 +3239,159 @@
       <w:r>
         <w:t xml:space="preserve">.</w:t>
       </w:r>
+      <w:r>
+        <w:t xml:space="preserve"> </w:t>
+      </w:r>
+      <w:r>
+        <w:t xml:space="preserve">The same holds for a subject followed by</w:t>
+      </w:r>
+      <w:r>
+        <w:t xml:space="preserve"> </w:t>
+      </w:r>
+      <w:r>
+        <w:t xml:space="preserve">“is what”</w:t>
+      </w:r>
+      <w:r>
+        <w:t xml:space="preserve"> </w:t>
+      </w:r>
+      <w:r>
+        <w:t xml:space="preserve">and a verb,</w:t>
+      </w:r>
+      <w:r>
+        <w:t xml:space="preserve"> </w:t>
+      </w:r>
+      <w:r>
+        <w:t xml:space="preserve">and for a tail of</w:t>
+      </w:r>
+      <w:r>
+        <w:t xml:space="preserve"> </w:t>
+      </w:r>
+      <w:r>
+        <w:t xml:space="preserve">“, which is why”</w:t>
+      </w:r>
+      <w:r>
+        <w:t xml:space="preserve"> </w:t>
+      </w:r>
+      <w:r>
+        <w:t xml:space="preserve">or</w:t>
+      </w:r>
+      <w:r>
+        <w:t xml:space="preserve"> </w:t>
+      </w:r>
+      <w:r>
+        <w:t xml:space="preserve">“, which is what”</w:t>
+      </w:r>
+      <w:r>
+        <w:t xml:space="preserve">:</w:t>
+      </w:r>
+      <w:r>
+        <w:t xml:space="preserve"> </w:t>
+      </w:r>
+      <w:r>
+        <w:t xml:space="preserve">“The risk is what says how a model does on neighborhoods outside the sample”</w:t>
+      </w:r>
+      <w:r>
+        <w:t xml:space="preserve"> </w:t>
+      </w:r>
+      <w:r>
+        <w:t xml:space="preserve">becomes</w:t>
+      </w:r>
+      <w:r>
+        <w:t xml:space="preserve"> </w:t>
+      </w:r>
+      <w:r>
+        <w:t xml:space="preserve">“The risk measures how well a model predicts neighborhoods outside the sample”</w:t>
+      </w:r>
+      <w:r>
+        <w:t xml:space="preserve">,</w:t>
+      </w:r>
+      <w:r>
+        <w:t xml:space="preserve"> </w:t>
+      </w:r>
+      <w:r>
+        <w:t xml:space="preserve">“Solving the equation is what this course calls learning”</w:t>
+      </w:r>
+      <w:r>
+        <w:t xml:space="preserve"> </w:t>
+      </w:r>
+      <w:r>
+        <w:t xml:space="preserve">becomes</w:t>
+      </w:r>
+      <w:r>
+        <w:t xml:space="preserve"> </w:t>
+      </w:r>
+      <w:r>
+        <w:t xml:space="preserve">“This course calls solving the equation learning”</w:t>
+      </w:r>
+      <w:r>
+        <w:t xml:space="preserve">,</w:t>
+      </w:r>
+      <w:r>
+        <w:t xml:space="preserve"> </w:t>
+      </w:r>
+      <w:r>
+        <w:t xml:space="preserve">“No label was used, which is why the task is unsupervised”</w:t>
+      </w:r>
+      <w:r>
+        <w:t xml:space="preserve"> </w:t>
+      </w:r>
+      <w:r>
+        <w:t xml:space="preserve">becomes</w:t>
+      </w:r>
+      <w:r>
+        <w:t xml:space="preserve"> </w:t>
+      </w:r>
+      <w:r>
+        <w:t xml:space="preserve">“No label was used, so the task is unsupervised”</w:t>
+      </w:r>
+      <w:r>
+        <w:t xml:space="preserve">,</w:t>
+      </w:r>
+      <w:r>
+        <w:t xml:space="preserve"> </w:t>
+      </w:r>
+      <w:r>
+        <w:t xml:space="preserve">and</w:t>
+      </w:r>
+      <w:r>
+        <w:t xml:space="preserve"> </w:t>
+      </w:r>
+      <w:r>
+        <w:t xml:space="preserve">“The step is cheap, which is what makes it affordable”</w:t>
+      </w:r>
+      <w:r>
+        <w:t xml:space="preserve"> </w:t>
+      </w:r>
+      <w:r>
+        <w:t xml:space="preserve">becomes</w:t>
+      </w:r>
+      <w:r>
+        <w:t xml:space="preserve"> </w:t>
+      </w:r>
+      <w:r>
+        <w:t xml:space="preserve">“The step is cheap, so it is affordable”</w:t>
+      </w:r>
+      <w:r>
+        <w:t xml:space="preserve">.</w:t>
+      </w:r>
+      <w:r>
+        <w:t xml:space="preserve"> </w:t>
+      </w:r>
+      <w:r>
+        <w:t xml:space="preserve">Keep a</w:t>
+      </w:r>
+      <w:r>
+        <w:t xml:space="preserve"> </w:t>
+      </w:r>
+      <w:r>
+        <w:t xml:space="preserve">“, which is why”</w:t>
+      </w:r>
+      <w:r>
+        <w:t xml:space="preserve"> </w:t>
+      </w:r>
+      <w:r>
+        <w:t xml:space="preserve">tail only where a real reason follows that the reader would not guess.</w:t>
+      </w:r>
     </w:p>
     <w:p>
       <w:pPr>

</xml_diff>

<commit_message>
Deploying to gh-pages from @ Morrison-Lab/psw@9e114b6bce8b6fa7966769311c3541a9d4a2512a 🚀
</commit_message>
<xml_diff>
--- a/chapters/avoid-cliches.docx
+++ b/chapters/avoid-cliches.docx
@@ -15,7 +15,7 @@
         <w:pStyle w:val="Date"/>
       </w:pPr>
       <w:r>
-        <w:t xml:space="preserve">Last modified: 2026-10-15 18:53:39 (PDT)</w:t>
+        <w:t xml:space="preserve">Last modified: 2026-10-15 21:21:35 (PDT)</w:t>
       </w:r>
     </w:p>
     <w:tbl>
@@ -4518,33 +4518,115 @@
         <w:t xml:space="preserve">chapter recommends.</w:t>
       </w:r>
     </w:p>
+    <w:bookmarkEnd w:id="38"/>
+    <w:bookmarkStart w:id="39" w:name="how-to-use-this-list"/>
+    <w:p>
+      <w:pPr>
+        <w:pStyle w:val="Heading2"/>
+      </w:pPr>
+      <w:r>
+        <w:t xml:space="preserve">9 How to use this list</w:t>
+      </w:r>
+    </w:p>
     <w:p>
       <w:pPr>
         <w:pStyle w:val="FirstParagraph"/>
       </w:pPr>
       <w:r>
-        <w:t xml:space="preserve">A short scan for these patterns before you submit a draft</w:t>
-      </w:r>
-      <w:r>
-        <w:t xml:space="preserve"> </w:t>
-      </w:r>
-      <w:r>
-        <w:t xml:space="preserve">catches most of them.</w:t>
-      </w:r>
-      <w:r>
-        <w:t xml:space="preserve"> </w:t>
-      </w:r>
-      <w:r>
-        <w:t xml:space="preserve">Cut the filler and the reflexes,</w:t>
-      </w:r>
-      <w:r>
-        <w:t xml:space="preserve"> </w:t>
-      </w:r>
-      <w:r>
-        <w:t xml:space="preserve">but keep your own voice.</w:t>
-      </w:r>
-    </w:p>
-    <w:bookmarkEnd w:id="38"/>
+        <w:t xml:space="preserve">Write plainly first, then scan the draft once before you share it.</w:t>
+      </w:r>
+      <w:r>
+        <w:t xml:space="preserve"> </w:t>
+      </w:r>
+      <w:r>
+        <w:t xml:space="preserve">Use the same list when you review someone else’s writing.</w:t>
+      </w:r>
+    </w:p>
+    <w:p>
+      <w:pPr>
+        <w:pStyle w:val="Compact"/>
+        <w:numPr>
+          <w:ilvl w:val="0"/>
+          <w:numId w:val="1010"/>
+        </w:numPr>
+      </w:pPr>
+      <w:r>
+        <w:t xml:space="preserve">One match means little.</w:t>
+      </w:r>
+      <w:r>
+        <w:t xml:space="preserve"> </w:t>
+      </w:r>
+      <w:r>
+        <w:t xml:space="preserve">Several matches in one paragraph, or the same pattern repeated across a document, are the real signal.</w:t>
+      </w:r>
+    </w:p>
+    <w:p>
+      <w:pPr>
+        <w:pStyle w:val="Compact"/>
+        <w:numPr>
+          <w:ilvl w:val="0"/>
+          <w:numId w:val="1010"/>
+        </w:numPr>
+      </w:pPr>
+      <w:r>
+        <w:t xml:space="preserve">Do not ban a word outright.</w:t>
+      </w:r>
+      <w:r>
+        <w:t xml:space="preserve"> </w:t>
+      </w:r>
+      <w:r>
+        <w:t xml:space="preserve">Keep a word or phrase that is the precise one for the sentence.</w:t>
+      </w:r>
+    </w:p>
+    <w:p>
+      <w:pPr>
+        <w:pStyle w:val="Compact"/>
+        <w:numPr>
+          <w:ilvl w:val="0"/>
+          <w:numId w:val="1010"/>
+        </w:numPr>
+      </w:pPr>
+      <w:r>
+        <w:t xml:space="preserve">Do not flatten your writing into a voiceless register.</w:t>
+      </w:r>
+      <w:r>
+        <w:t xml:space="preserve"> </w:t>
+      </w:r>
+      <w:r>
+        <w:t xml:space="preserve">Cut the filler and the reflexes, and keep your own voice.</w:t>
+      </w:r>
+    </w:p>
+    <w:p>
+      <w:pPr>
+        <w:pStyle w:val="Compact"/>
+        <w:numPr>
+          <w:ilvl w:val="0"/>
+          <w:numId w:val="1010"/>
+        </w:numPr>
+      </w:pPr>
+      <w:r>
+        <w:t xml:space="preserve">Skip the scan for code, terse status lines and short conversational replies.</w:t>
+      </w:r>
+    </w:p>
+    <w:p>
+      <w:pPr>
+        <w:pStyle w:val="Compact"/>
+        <w:numPr>
+          <w:ilvl w:val="0"/>
+          <w:numId w:val="1010"/>
+        </w:numPr>
+      </w:pPr>
+      <w:r>
+        <w:t xml:space="preserve">Do not accuse a writer of using an assistant on the strength of the list.</w:t>
+      </w:r>
+      <w:r>
+        <w:t xml:space="preserve"> </w:t>
+      </w:r>
+      <w:r>
+        <w:t xml:space="preserve">Say which pattern weakens the sentence and how to fix it.</w:t>
+      </w:r>
+    </w:p>
+    <w:bookmarkEnd w:id="39"/>
     <w:sectPr>
       <w:footnotePr>
         <w:numRestart w:val="eachSect"/>
@@ -4786,6 +4868,9 @@
     <w:abstractNumId w:val="991"/>
   </w:num>
   <w:num w:numId="1009">
+    <w:abstractNumId w:val="991"/>
+  </w:num>
+  <w:num w:numId="1010">
     <w:abstractNumId w:val="991"/>
   </w:num>
 </w:numbering>

</xml_diff>

<commit_message>
Deploying to gh-pages from @ Morrison-Lab/psw@e93369069da9e3f54c26c56e682ecb656beb2ad4 🚀
</commit_message>
<xml_diff>
--- a/chapters/avoid-cliches.docx
+++ b/chapters/avoid-cliches.docx
@@ -15,7 +15,7 @@
         <w:pStyle w:val="Date"/>
       </w:pPr>
       <w:r>
-        <w:t xml:space="preserve">Last modified: 2026-10-16 09:59:07 (PDT)</w:t>
+        <w:t xml:space="preserve">Last modified: 2026-10-16 10:07:11 (PDT)</w:t>
       </w:r>
     </w:p>
     <w:tbl>
@@ -2465,7 +2465,7 @@
         <w:t xml:space="preserve"> </w:t>
       </w:r>
       <w:r>
-        <w:t xml:space="preserve">The first pair is from the</w:t>
+        <w:t xml:space="preserve">For the first pair, see the</w:t>
       </w:r>
       <w:r>
         <w:t xml:space="preserve"> </w:t>

</xml_diff>

<commit_message>
Deploying to gh-pages from @ Morrison-Lab/psw@9d99603517fdf2948859da625337fe759858ba53 🚀
</commit_message>
<xml_diff>
--- a/chapters/avoid-cliches.docx
+++ b/chapters/avoid-cliches.docx
@@ -15,7 +15,7 @@
         <w:pStyle w:val="Date"/>
       </w:pPr>
       <w:r>
-        <w:t xml:space="preserve">Last modified: 2026-10-28 00:37:47 (PDT)</w:t>
+        <w:t xml:space="preserve">Last modified: 2026-10-28 00:45:54 (PDT)</w:t>
       </w:r>
     </w:p>
     <w:tbl>
@@ -336,7 +336,7 @@
         <w:t xml:space="preserve">It catalogs the most common clichés so you can remove them.</w:t>
       </w:r>
     </w:p>
-    <w:bookmarkStart w:id="20" w:name="terms-used-in-this-chapter"/>
+    <w:bookmarkStart w:id="21" w:name="terms-used-in-this-chapter"/>
     <w:p>
       <w:pPr>
         <w:pStyle w:val="Heading2"/>
@@ -350,10 +350,24 @@
         <w:pStyle w:val="FirstParagraph"/>
       </w:pPr>
       <w:r>
-        <w:t xml:space="preserve">The rest of this chapter uses these terms.</w:t>
-      </w:r>
-    </w:p>
-    <w:bookmarkStart w:id="14" w:name="def-register"/>
+        <w:t xml:space="preserve">The rest of this chapter uses these</w:t>
+      </w:r>
+      <w:r>
+        <w:t xml:space="preserve"> </w:t>
+      </w:r>
+      <w:hyperlink r:id="rId14">
+        <w:r>
+          <w:rPr>
+            <w:rStyle w:val="Hyperlink"/>
+          </w:rPr>
+          <w:t xml:space="preserve">term</w:t>
+        </w:r>
+      </w:hyperlink>
+      <w:r>
+        <w:t xml:space="preserve">s.</w:t>
+      </w:r>
+    </w:p>
+    <w:bookmarkStart w:id="15" w:name="def-register"/>
     <w:p>
       <w:pPr>
         <w:pStyle w:val="BodyText"/>
@@ -400,8 +414,8 @@
         <w:t xml:space="preserve">such as conversational, technical, or promotional.</w:t>
       </w:r>
     </w:p>
-    <w:bookmarkEnd w:id="14"/>
-    <w:bookmarkStart w:id="15" w:name="def-antithesis"/>
+    <w:bookmarkEnd w:id="15"/>
+    <w:bookmarkStart w:id="16" w:name="def-antithesis"/>
     <w:p>
       <w:pPr>
         <w:pStyle w:val="BodyText"/>
@@ -469,8 +483,8 @@
         <w:t xml:space="preserve">.</w:t>
       </w:r>
     </w:p>
-    <w:bookmarkEnd w:id="15"/>
-    <w:bookmarkStart w:id="16" w:name="def-hedge"/>
+    <w:bookmarkEnd w:id="16"/>
+    <w:bookmarkStart w:id="17" w:name="def-hedge"/>
     <w:p>
       <w:pPr>
         <w:pStyle w:val="BodyText"/>
@@ -544,8 +558,8 @@
         <w:t xml:space="preserve">.</w:t>
       </w:r>
     </w:p>
-    <w:bookmarkEnd w:id="16"/>
-    <w:bookmarkStart w:id="17" w:name="def-copula"/>
+    <w:bookmarkEnd w:id="17"/>
+    <w:bookmarkStart w:id="18" w:name="def-copula"/>
     <w:p>
       <w:pPr>
         <w:pStyle w:val="BodyText"/>
@@ -622,8 +636,8 @@
         <w:t xml:space="preserve">.</w:t>
       </w:r>
     </w:p>
-    <w:bookmarkEnd w:id="17"/>
-    <w:bookmarkStart w:id="18" w:name="def-participial-clause"/>
+    <w:bookmarkEnd w:id="18"/>
+    <w:bookmarkStart w:id="19" w:name="def-participial-clause"/>
     <w:p>
       <w:pPr>
         <w:pStyle w:val="BodyText"/>
@@ -706,8 +720,8 @@
         <w:t xml:space="preserve">at the end of a sentence.</w:t>
       </w:r>
     </w:p>
-    <w:bookmarkEnd w:id="18"/>
-    <w:bookmarkStart w:id="19" w:name="def-aphorism"/>
+    <w:bookmarkEnd w:id="19"/>
+    <w:bookmarkStart w:id="20" w:name="def-aphorism"/>
     <w:p>
       <w:pPr>
         <w:pStyle w:val="BodyText"/>
@@ -748,9 +762,9 @@
         <w:t xml:space="preserve">that states a general truth or verdict.</w:t>
       </w:r>
     </w:p>
-    <w:bookmarkEnd w:id="19"/>
     <w:bookmarkEnd w:id="20"/>
-    <w:bookmarkStart w:id="21" w:name="a-caveat"/>
+    <w:bookmarkEnd w:id="21"/>
+    <w:bookmarkStart w:id="22" w:name="a-caveat"/>
     <w:p>
       <w:pPr>
         <w:pStyle w:val="Heading2"/>
@@ -820,8 +834,8 @@
         <w:t xml:space="preserve">trying to avoid every word on a list.</w:t>
       </w:r>
     </w:p>
-    <w:bookmarkEnd w:id="21"/>
-    <w:bookmarkStart w:id="24" w:name="overused-vocabulary"/>
+    <w:bookmarkEnd w:id="22"/>
+    <w:bookmarkStart w:id="25" w:name="overused-vocabulary"/>
     <w:p>
       <w:pPr>
         <w:pStyle w:val="Heading2"/>
@@ -858,7 +872,7 @@
       <w:r>
         <w:t xml:space="preserve"> </w:t>
       </w:r>
-      <w:hyperlink r:id="rId22">
+      <w:hyperlink r:id="rId23">
         <w:r>
           <w:rPr>
             <w:rStyle w:val="Hyperlink"/>
@@ -903,7 +917,7 @@
       <w:tr>
         <w:tc>
           <w:tcPr/>
-          <w:bookmarkStart w:id="23" w:name="tbl-overused-vocabulary"/>
+          <w:bookmarkStart w:id="24" w:name="tbl-overused-vocabulary"/>
           <w:p>
             <w:pPr>
               <w:jc w:val="center"/>
@@ -1712,7 +1726,7 @@
               </w:tc>
             </w:tr>
           </w:tbl>
-          <w:bookmarkEnd w:id="23"/>
+          <w:bookmarkEnd w:id="24"/>
           <w:p/>
         </w:tc>
       </w:tr>
@@ -1982,8 +1996,8 @@
         <w:t xml:space="preserve">“more than just”</w:t>
       </w:r>
     </w:p>
-    <w:bookmarkEnd w:id="24"/>
-    <w:bookmarkStart w:id="26" w:name="rhetorical-reflexes"/>
+    <w:bookmarkEnd w:id="25"/>
+    <w:bookmarkStart w:id="27" w:name="rhetorical-reflexes"/>
     <w:p>
       <w:pPr>
         <w:pStyle w:val="Heading2"/>
@@ -2044,7 +2058,7 @@
         <w:t xml:space="preserve">It promises a profound contrast and usually delivers a hollow one.</w:t>
       </w:r>
     </w:p>
-    <w:bookmarkStart w:id="25" w:name="exm-antithesis"/>
+    <w:bookmarkStart w:id="26" w:name="exm-antithesis"/>
     <w:p>
       <w:pPr>
         <w:pStyle w:val="BodyText"/>
@@ -2138,7 +2152,7 @@
         <w:t xml:space="preserve">frame makes none.</w:t>
       </w:r>
     </w:p>
-    <w:bookmarkEnd w:id="25"/>
+    <w:bookmarkEnd w:id="26"/>
     <w:p>
       <w:pPr>
         <w:pStyle w:val="BodyText"/>
@@ -2315,8 +2329,8 @@
         <w:t xml:space="preserve">only restates what you just said adds nothing. End on a real point.</w:t>
       </w:r>
     </w:p>
-    <w:bookmarkEnd w:id="26"/>
-    <w:bookmarkStart w:id="29" w:name="say-what-it-is-before-what-it-is-not"/>
+    <w:bookmarkEnd w:id="27"/>
+    <w:bookmarkStart w:id="30" w:name="say-what-it-is-before-what-it-is-not"/>
     <w:p>
       <w:pPr>
         <w:pStyle w:val="Heading2"/>
@@ -2363,7 +2377,7 @@
         <w:t xml:space="preserve">until the second clause arrives.</w:t>
       </w:r>
     </w:p>
-    <w:bookmarkStart w:id="28" w:name="exm-positive-first"/>
+    <w:bookmarkStart w:id="29" w:name="exm-positive-first"/>
     <w:p>
       <w:pPr>
         <w:pStyle w:val="BodyText"/>
@@ -2470,7 +2484,7 @@
       <w:r>
         <w:t xml:space="preserve"> </w:t>
       </w:r>
-      <w:hyperlink r:id="rId27">
+      <w:hyperlink r:id="rId28">
         <w:r>
           <w:rPr>
             <w:rStyle w:val="Hyperlink"/>
@@ -2482,7 +2496,7 @@
         <w:t xml:space="preserve">.</w:t>
       </w:r>
     </w:p>
-    <w:bookmarkEnd w:id="28"/>
+    <w:bookmarkEnd w:id="29"/>
     <w:p>
       <w:pPr>
         <w:pStyle w:val="BodyText"/>
@@ -2535,8 +2549,8 @@
         <w:t xml:space="preserve">cut it and keep the claim.</w:t>
       </w:r>
     </w:p>
-    <w:bookmarkEnd w:id="29"/>
-    <w:bookmarkStart w:id="35" w:name="clichéd-sentence-shapes"/>
+    <w:bookmarkEnd w:id="30"/>
+    <w:bookmarkStart w:id="36" w:name="clichéd-sentence-shapes"/>
     <w:p>
       <w:pPr>
         <w:pStyle w:val="Heading2"/>
@@ -2579,7 +2593,7 @@
         <w:t xml:space="preserve">that stage a point instead of stating it.</w:t>
       </w:r>
     </w:p>
-    <w:bookmarkStart w:id="30" w:name="exm-staged-point"/>
+    <w:bookmarkStart w:id="31" w:name="exm-staged-point"/>
     <w:p>
       <w:pPr>
         <w:pStyle w:val="BodyText"/>
@@ -2863,7 +2877,7 @@
         <w:t xml:space="preserve">The second version states the claim once.</w:t>
       </w:r>
     </w:p>
-    <w:bookmarkEnd w:id="30"/>
+    <w:bookmarkEnd w:id="31"/>
     <w:p>
       <w:pPr>
         <w:pStyle w:val="BodyText"/>
@@ -4025,7 +4039,7 @@
       <w:r>
         <w:t xml:space="preserve">(</w:t>
       </w:r>
-      <w:hyperlink r:id="rId31">
+      <w:hyperlink r:id="rId32">
         <w:r>
           <w:rPr>
             <w:rStyle w:val="Hyperlink"/>
@@ -4060,7 +4074,7 @@
       <w:r>
         <w:t xml:space="preserve">(</w:t>
       </w:r>
-      <w:hyperlink r:id="rId32">
+      <w:hyperlink r:id="rId33">
         <w:r>
           <w:rPr>
             <w:rStyle w:val="Hyperlink"/>
@@ -4089,7 +4103,7 @@
       <w:r>
         <w:t xml:space="preserve">(</w:t>
       </w:r>
-      <w:hyperlink r:id="rId33">
+      <w:hyperlink r:id="rId34">
         <w:r>
           <w:rPr>
             <w:rStyle w:val="Hyperlink"/>
@@ -4118,7 +4132,7 @@
       <w:r>
         <w:t xml:space="preserve">(</w:t>
       </w:r>
-      <w:hyperlink r:id="rId34">
+      <w:hyperlink r:id="rId35">
         <w:r>
           <w:rPr>
             <w:rStyle w:val="Hyperlink"/>
@@ -4130,8 +4144,8 @@
         <w:t xml:space="preserve">).</w:t>
       </w:r>
     </w:p>
-    <w:bookmarkEnd w:id="35"/>
-    <w:bookmarkStart w:id="36" w:name="formatting-habits"/>
+    <w:bookmarkEnd w:id="36"/>
+    <w:bookmarkStart w:id="37" w:name="formatting-habits"/>
     <w:p>
       <w:pPr>
         <w:pStyle w:val="Heading2"/>
@@ -4293,8 +4307,8 @@
         <w:t xml:space="preserve">ideas.</w:t>
       </w:r>
     </w:p>
-    <w:bookmarkEnd w:id="36"/>
-    <w:bookmarkStart w:id="38" w:name="tone"/>
+    <w:bookmarkEnd w:id="37"/>
+    <w:bookmarkStart w:id="39" w:name="tone"/>
     <w:p>
       <w:pPr>
         <w:pStyle w:val="Heading2"/>
@@ -4503,7 +4517,7 @@
       <w:r>
         <w:t xml:space="preserve"> </w:t>
       </w:r>
-      <w:hyperlink r:id="rId37">
+      <w:hyperlink r:id="rId38">
         <w:r>
           <w:rPr>
             <w:rStyle w:val="Hyperlink"/>
@@ -4518,8 +4532,8 @@
         <w:t xml:space="preserve">chapter recommends.</w:t>
       </w:r>
     </w:p>
-    <w:bookmarkEnd w:id="38"/>
-    <w:bookmarkStart w:id="39" w:name="how-to-use-this-list"/>
+    <w:bookmarkEnd w:id="39"/>
+    <w:bookmarkStart w:id="40" w:name="how-to-use-this-list"/>
     <w:p>
       <w:pPr>
         <w:pStyle w:val="Heading2"/>
@@ -4587,7 +4601,21 @@
         </w:numPr>
       </w:pPr>
       <w:r>
-        <w:t xml:space="preserve">Do not flatten your writing into a voiceless register.</w:t>
+        <w:t xml:space="preserve">Do not flatten your writing into a voiceless</w:t>
+      </w:r>
+      <w:r>
+        <w:t xml:space="preserve"> </w:t>
+      </w:r>
+      <w:hyperlink w:anchor="def-register">
+        <w:r>
+          <w:rPr>
+            <w:rStyle w:val="Hyperlink"/>
+          </w:rPr>
+          <w:t xml:space="preserve">register</w:t>
+        </w:r>
+      </w:hyperlink>
+      <w:r>
+        <w:t xml:space="preserve">.</w:t>
       </w:r>
       <w:r>
         <w:t xml:space="preserve"> </w:t>
@@ -4626,7 +4654,7 @@
         <w:t xml:space="preserve">Say which pattern weakens the sentence and how to fix it.</w:t>
       </w:r>
     </w:p>
-    <w:bookmarkEnd w:id="39"/>
+    <w:bookmarkEnd w:id="40"/>
     <w:sectPr>
       <w:footnotePr>
         <w:numRestart w:val="eachSect"/>

</xml_diff>

<commit_message>
Deploying to gh-pages from @ Morrison-Lab/psw@8147c858760a9abe686d8a52d9626d9c3bf1834c 🚀
</commit_message>
<xml_diff>
--- a/chapters/avoid-cliches.docx
+++ b/chapters/avoid-cliches.docx
@@ -15,7 +15,7 @@
         <w:pStyle w:val="Date"/>
       </w:pPr>
       <w:r>
-        <w:t xml:space="preserve">Last modified: 2026-10-29 08:00:13 (PDT)</w:t>
+        <w:t xml:space="preserve">Last modified: 2026-10-29 12:57:04 (PDT)</w:t>
       </w:r>
     </w:p>
     <w:tbl>
@@ -3004,13 +3004,69 @@
         <w:t xml:space="preserve"> </w:t>
       </w:r>
       <w:r>
-        <w:t xml:space="preserve">something of the reader.</w:t>
-      </w:r>
-      <w:r>
-        <w:t xml:space="preserve"> </w:t>
-      </w:r>
-      <w:r>
-        <w:t xml:space="preserve">Name who does what.</w:t>
+        <w:t xml:space="preserve">something of the reader,</w:t>
+      </w:r>
+      <w:r>
+        <w:t xml:space="preserve"> </w:t>
+      </w:r>
+      <w:r>
+        <w:t xml:space="preserve">or a mathematical object that</w:t>
+      </w:r>
+      <w:r>
+        <w:t xml:space="preserve"> </w:t>
+      </w:r>
+      <w:r>
+        <w:t xml:space="preserve">“recommends”</w:t>
+      </w:r>
+      <w:r>
+        <w:t xml:space="preserve">,</w:t>
+      </w:r>
+      <w:r>
+        <w:t xml:space="preserve"> </w:t>
+      </w:r>
+      <w:r>
+        <w:t xml:space="preserve">“knows”</w:t>
+      </w:r>
+      <w:r>
+        <w:t xml:space="preserve"> </w:t>
+      </w:r>
+      <w:r>
+        <w:t xml:space="preserve">or</w:t>
+      </w:r>
+      <w:r>
+        <w:t xml:space="preserve"> </w:t>
+      </w:r>
+      <w:r>
+        <w:t xml:space="preserve">“wants”</w:t>
+      </w:r>
+      <w:r>
+        <w:t xml:space="preserve"> </w:t>
+      </w:r>
+      <w:r>
+        <w:t xml:space="preserve">something.</w:t>
+      </w:r>
+      <w:r>
+        <w:t xml:space="preserve"> </w:t>
+      </w:r>
+      <w:r>
+        <w:t xml:space="preserve">Name who does what, and state the condition the phrase hides</w:t>
+      </w:r>
+      <w:r>
+        <w:t xml:space="preserve"> </w:t>
+      </w:r>
+      <w:r>
+        <w:t xml:space="preserve">(</w:t>
+      </w:r>
+      <w:hyperlink r:id="rId32">
+        <w:r>
+          <w:rPr>
+            <w:rStyle w:val="Hyperlink"/>
+          </w:rPr>
+          <w:t xml:space="preserve">Avoid vague and metaphorical language</w:t>
+        </w:r>
+      </w:hyperlink>
+      <w:r>
+        <w:t xml:space="preserve">).</w:t>
       </w:r>
     </w:p>
     <w:p>
@@ -4039,7 +4095,7 @@
       <w:r>
         <w:t xml:space="preserve">(</w:t>
       </w:r>
-      <w:hyperlink r:id="rId32">
+      <w:hyperlink r:id="rId33">
         <w:r>
           <w:rPr>
             <w:rStyle w:val="Hyperlink"/>
@@ -4074,7 +4130,7 @@
       <w:r>
         <w:t xml:space="preserve">(</w:t>
       </w:r>
-      <w:hyperlink r:id="rId33">
+      <w:hyperlink r:id="rId34">
         <w:r>
           <w:rPr>
             <w:rStyle w:val="Hyperlink"/>
@@ -4103,7 +4159,7 @@
       <w:r>
         <w:t xml:space="preserve">(</w:t>
       </w:r>
-      <w:hyperlink r:id="rId34">
+      <w:hyperlink r:id="rId35">
         <w:r>
           <w:rPr>
             <w:rStyle w:val="Hyperlink"/>
@@ -4132,7 +4188,7 @@
       <w:r>
         <w:t xml:space="preserve">(</w:t>
       </w:r>
-      <w:hyperlink r:id="rId35">
+      <w:hyperlink r:id="rId32">
         <w:r>
           <w:rPr>
             <w:rStyle w:val="Hyperlink"/>

</xml_diff>